<commit_message>
assignments, dbms lab updated
</commit_message>
<xml_diff>
--- a/3rdSem/Assignments/Assignment1/Ans/docx/COA_Assignment1_Answers.docx
+++ b/3rdSem/Assignments/Assignment1/Ans/docx/COA_Assignment1_Answers.docx
@@ -214,12 +214,10 @@
           <w:sz w:val="19"/>
           <w:szCs w:val="19"/>
         </w:rPr>
-        <w:t xml:space="preserve">MOV R1,#8   </w:t>
-      </w:r>
-    </w:p>
-    <w:p>
-      <w:pPr>
-        <w:spacing w:after="120"/>
+        <w:t>MOV R</w:t>
+      </w:r>
+      <w:proofErr w:type="gramStart"/>
+      <w:r>
         <w:rPr>
           <w:rFonts w:ascii="Calibri" w:eastAsia="Calibri" w:hAnsi="Calibri" w:cs="Calibri"/>
           <w:i/>
@@ -227,7 +225,9 @@
           <w:sz w:val="19"/>
           <w:szCs w:val="19"/>
         </w:rPr>
-      </w:pPr>
+        <w:t>1,#</w:t>
+      </w:r>
+      <w:proofErr w:type="gramEnd"/>
       <w:r>
         <w:rPr>
           <w:rFonts w:ascii="Calibri" w:eastAsia="Calibri" w:hAnsi="Calibri" w:cs="Calibri"/>
@@ -236,7 +236,7 @@
           <w:sz w:val="19"/>
           <w:szCs w:val="19"/>
         </w:rPr>
-        <w:t xml:space="preserve">MOV R2,#3   </w:t>
+        <w:t xml:space="preserve">8   </w:t>
       </w:r>
     </w:p>
     <w:p>
@@ -258,12 +258,10 @@
           <w:sz w:val="19"/>
           <w:szCs w:val="19"/>
         </w:rPr>
-        <w:t xml:space="preserve">ADD R3,R1,R2   </w:t>
-      </w:r>
-    </w:p>
-    <w:p>
-      <w:pPr>
-        <w:spacing w:after="120"/>
+        <w:t>MOV R</w:t>
+      </w:r>
+      <w:proofErr w:type="gramStart"/>
+      <w:r>
         <w:rPr>
           <w:rFonts w:ascii="Calibri" w:eastAsia="Calibri" w:hAnsi="Calibri" w:cs="Calibri"/>
           <w:i/>
@@ -271,7 +269,9 @@
           <w:sz w:val="19"/>
           <w:szCs w:val="19"/>
         </w:rPr>
-      </w:pPr>
+        <w:t>2,#</w:t>
+      </w:r>
+      <w:proofErr w:type="gramEnd"/>
       <w:r>
         <w:rPr>
           <w:rFonts w:ascii="Calibri" w:eastAsia="Calibri" w:hAnsi="Calibri" w:cs="Calibri"/>
@@ -280,7 +280,7 @@
           <w:sz w:val="19"/>
           <w:szCs w:val="19"/>
         </w:rPr>
-        <w:t xml:space="preserve">SUB R2,R3,R1   </w:t>
+        <w:t xml:space="preserve">3   </w:t>
       </w:r>
     </w:p>
     <w:p>
@@ -302,12 +302,10 @@
           <w:sz w:val="19"/>
           <w:szCs w:val="19"/>
         </w:rPr>
-        <w:t xml:space="preserve">MULT R4,R2,R2   </w:t>
-      </w:r>
-    </w:p>
-    <w:p>
-      <w:pPr>
-        <w:spacing w:after="120"/>
+        <w:t>ADD R</w:t>
+      </w:r>
+      <w:proofErr w:type="gramStart"/>
+      <w:r>
         <w:rPr>
           <w:rFonts w:ascii="Calibri" w:eastAsia="Calibri" w:hAnsi="Calibri" w:cs="Calibri"/>
           <w:i/>
@@ -315,7 +313,9 @@
           <w:sz w:val="19"/>
           <w:szCs w:val="19"/>
         </w:rPr>
-      </w:pPr>
+        <w:t>3,R1,R</w:t>
+      </w:r>
+      <w:proofErr w:type="gramEnd"/>
       <w:r>
         <w:rPr>
           <w:rFonts w:ascii="Calibri" w:eastAsia="Calibri" w:hAnsi="Calibri" w:cs="Calibri"/>
@@ -324,7 +324,139 @@
           <w:sz w:val="19"/>
           <w:szCs w:val="19"/>
         </w:rPr>
-        <w:t>ADD R2,R4,R1</w:t>
+        <w:t xml:space="preserve">2   </w:t>
+      </w:r>
+    </w:p>
+    <w:p>
+      <w:pPr>
+        <w:spacing w:after="120"/>
+        <w:rPr>
+          <w:rFonts w:ascii="Calibri" w:eastAsia="Calibri" w:hAnsi="Calibri" w:cs="Calibri"/>
+          <w:i/>
+          <w:iCs/>
+          <w:sz w:val="19"/>
+          <w:szCs w:val="19"/>
+        </w:rPr>
+      </w:pPr>
+      <w:r>
+        <w:rPr>
+          <w:rFonts w:ascii="Calibri" w:eastAsia="Calibri" w:hAnsi="Calibri" w:cs="Calibri"/>
+          <w:i/>
+          <w:iCs/>
+          <w:sz w:val="19"/>
+          <w:szCs w:val="19"/>
+        </w:rPr>
+        <w:t>SUB R</w:t>
+      </w:r>
+      <w:proofErr w:type="gramStart"/>
+      <w:r>
+        <w:rPr>
+          <w:rFonts w:ascii="Calibri" w:eastAsia="Calibri" w:hAnsi="Calibri" w:cs="Calibri"/>
+          <w:i/>
+          <w:iCs/>
+          <w:sz w:val="19"/>
+          <w:szCs w:val="19"/>
+        </w:rPr>
+        <w:t>2,R3,R</w:t>
+      </w:r>
+      <w:proofErr w:type="gramEnd"/>
+      <w:r>
+        <w:rPr>
+          <w:rFonts w:ascii="Calibri" w:eastAsia="Calibri" w:hAnsi="Calibri" w:cs="Calibri"/>
+          <w:i/>
+          <w:iCs/>
+          <w:sz w:val="19"/>
+          <w:szCs w:val="19"/>
+        </w:rPr>
+        <w:t xml:space="preserve">1   </w:t>
+      </w:r>
+    </w:p>
+    <w:p>
+      <w:pPr>
+        <w:spacing w:after="120"/>
+        <w:rPr>
+          <w:rFonts w:ascii="Calibri" w:eastAsia="Calibri" w:hAnsi="Calibri" w:cs="Calibri"/>
+          <w:i/>
+          <w:iCs/>
+          <w:sz w:val="19"/>
+          <w:szCs w:val="19"/>
+        </w:rPr>
+      </w:pPr>
+      <w:r>
+        <w:rPr>
+          <w:rFonts w:ascii="Calibri" w:eastAsia="Calibri" w:hAnsi="Calibri" w:cs="Calibri"/>
+          <w:i/>
+          <w:iCs/>
+          <w:sz w:val="19"/>
+          <w:szCs w:val="19"/>
+        </w:rPr>
+        <w:t>MULT R</w:t>
+      </w:r>
+      <w:proofErr w:type="gramStart"/>
+      <w:r>
+        <w:rPr>
+          <w:rFonts w:ascii="Calibri" w:eastAsia="Calibri" w:hAnsi="Calibri" w:cs="Calibri"/>
+          <w:i/>
+          <w:iCs/>
+          <w:sz w:val="19"/>
+          <w:szCs w:val="19"/>
+        </w:rPr>
+        <w:t>4,R2,R</w:t>
+      </w:r>
+      <w:proofErr w:type="gramEnd"/>
+      <w:r>
+        <w:rPr>
+          <w:rFonts w:ascii="Calibri" w:eastAsia="Calibri" w:hAnsi="Calibri" w:cs="Calibri"/>
+          <w:i/>
+          <w:iCs/>
+          <w:sz w:val="19"/>
+          <w:szCs w:val="19"/>
+        </w:rPr>
+        <w:t xml:space="preserve">2   </w:t>
+      </w:r>
+    </w:p>
+    <w:p>
+      <w:pPr>
+        <w:spacing w:after="120"/>
+        <w:rPr>
+          <w:rFonts w:ascii="Calibri" w:eastAsia="Calibri" w:hAnsi="Calibri" w:cs="Calibri"/>
+          <w:i/>
+          <w:iCs/>
+          <w:sz w:val="19"/>
+          <w:szCs w:val="19"/>
+        </w:rPr>
+      </w:pPr>
+      <w:r>
+        <w:rPr>
+          <w:rFonts w:ascii="Calibri" w:eastAsia="Calibri" w:hAnsi="Calibri" w:cs="Calibri"/>
+          <w:i/>
+          <w:iCs/>
+          <w:sz w:val="19"/>
+          <w:szCs w:val="19"/>
+        </w:rPr>
+        <w:t>ADD R</w:t>
+      </w:r>
+      <w:proofErr w:type="gramStart"/>
+      <w:r>
+        <w:rPr>
+          <w:rFonts w:ascii="Calibri" w:eastAsia="Calibri" w:hAnsi="Calibri" w:cs="Calibri"/>
+          <w:i/>
+          <w:iCs/>
+          <w:sz w:val="19"/>
+          <w:szCs w:val="19"/>
+        </w:rPr>
+        <w:t>2,R4,R</w:t>
+      </w:r>
+      <w:proofErr w:type="gramEnd"/>
+      <w:r>
+        <w:rPr>
+          <w:rFonts w:ascii="Calibri" w:eastAsia="Calibri" w:hAnsi="Calibri" w:cs="Calibri"/>
+          <w:i/>
+          <w:iCs/>
+          <w:sz w:val="19"/>
+          <w:szCs w:val="19"/>
+        </w:rPr>
+        <w:t>1</w:t>
       </w:r>
     </w:p>
     <w:tbl>
@@ -419,7 +551,25 @@
                 <w:sz w:val="19"/>
                 <w:szCs w:val="19"/>
               </w:rPr>
-              <w:t>MOV R1,#8</w:t>
+              <w:t>MOV R</w:t>
+            </w:r>
+            <w:proofErr w:type="gramStart"/>
+            <w:r>
+              <w:rPr>
+                <w:rFonts w:ascii="Consolas" w:eastAsia="Consolas" w:hAnsi="Consolas" w:cs="Consolas"/>
+                <w:sz w:val="19"/>
+                <w:szCs w:val="19"/>
+              </w:rPr>
+              <w:t>1,#</w:t>
+            </w:r>
+            <w:proofErr w:type="gramEnd"/>
+            <w:r>
+              <w:rPr>
+                <w:rFonts w:ascii="Consolas" w:eastAsia="Consolas" w:hAnsi="Consolas" w:cs="Consolas"/>
+                <w:sz w:val="19"/>
+                <w:szCs w:val="19"/>
+              </w:rPr>
+              <w:t>8</w:t>
             </w:r>
           </w:p>
         </w:tc>
@@ -463,7 +613,25 @@
                 <w:sz w:val="19"/>
                 <w:szCs w:val="19"/>
               </w:rPr>
-              <w:t>MOV R2,#3</w:t>
+              <w:t>MOV R</w:t>
+            </w:r>
+            <w:proofErr w:type="gramStart"/>
+            <w:r>
+              <w:rPr>
+                <w:rFonts w:ascii="Consolas" w:eastAsia="Consolas" w:hAnsi="Consolas" w:cs="Consolas"/>
+                <w:sz w:val="19"/>
+                <w:szCs w:val="19"/>
+              </w:rPr>
+              <w:t>2,#</w:t>
+            </w:r>
+            <w:proofErr w:type="gramEnd"/>
+            <w:r>
+              <w:rPr>
+                <w:rFonts w:ascii="Consolas" w:eastAsia="Consolas" w:hAnsi="Consolas" w:cs="Consolas"/>
+                <w:sz w:val="19"/>
+                <w:szCs w:val="19"/>
+              </w:rPr>
+              <w:t>3</w:t>
             </w:r>
           </w:p>
         </w:tc>
@@ -507,7 +675,25 @@
                 <w:sz w:val="19"/>
                 <w:szCs w:val="19"/>
               </w:rPr>
-              <w:t>ADD R3,R1,R2</w:t>
+              <w:t>ADD R</w:t>
+            </w:r>
+            <w:proofErr w:type="gramStart"/>
+            <w:r>
+              <w:rPr>
+                <w:rFonts w:ascii="Consolas" w:eastAsia="Consolas" w:hAnsi="Consolas" w:cs="Consolas"/>
+                <w:sz w:val="19"/>
+                <w:szCs w:val="19"/>
+              </w:rPr>
+              <w:t>3,R1,R</w:t>
+            </w:r>
+            <w:proofErr w:type="gramEnd"/>
+            <w:r>
+              <w:rPr>
+                <w:rFonts w:ascii="Consolas" w:eastAsia="Consolas" w:hAnsi="Consolas" w:cs="Consolas"/>
+                <w:sz w:val="19"/>
+                <w:szCs w:val="19"/>
+              </w:rPr>
+              <w:t>2</w:t>
             </w:r>
           </w:p>
         </w:tc>
@@ -551,7 +737,25 @@
                 <w:sz w:val="19"/>
                 <w:szCs w:val="19"/>
               </w:rPr>
-              <w:t>SUB R2,R3,R1</w:t>
+              <w:t>SUB R</w:t>
+            </w:r>
+            <w:proofErr w:type="gramStart"/>
+            <w:r>
+              <w:rPr>
+                <w:rFonts w:ascii="Consolas" w:eastAsia="Consolas" w:hAnsi="Consolas" w:cs="Consolas"/>
+                <w:sz w:val="19"/>
+                <w:szCs w:val="19"/>
+              </w:rPr>
+              <w:t>2,R3,R</w:t>
+            </w:r>
+            <w:proofErr w:type="gramEnd"/>
+            <w:r>
+              <w:rPr>
+                <w:rFonts w:ascii="Consolas" w:eastAsia="Consolas" w:hAnsi="Consolas" w:cs="Consolas"/>
+                <w:sz w:val="19"/>
+                <w:szCs w:val="19"/>
+              </w:rPr>
+              <w:t>1</w:t>
             </w:r>
           </w:p>
         </w:tc>
@@ -595,7 +799,25 @@
                 <w:sz w:val="19"/>
                 <w:szCs w:val="19"/>
               </w:rPr>
-              <w:t>MULT R4,R2,R2</w:t>
+              <w:t>MULT R</w:t>
+            </w:r>
+            <w:proofErr w:type="gramStart"/>
+            <w:r>
+              <w:rPr>
+                <w:rFonts w:ascii="Consolas" w:eastAsia="Consolas" w:hAnsi="Consolas" w:cs="Consolas"/>
+                <w:sz w:val="19"/>
+                <w:szCs w:val="19"/>
+              </w:rPr>
+              <w:t>4,R2,R</w:t>
+            </w:r>
+            <w:proofErr w:type="gramEnd"/>
+            <w:r>
+              <w:rPr>
+                <w:rFonts w:ascii="Consolas" w:eastAsia="Consolas" w:hAnsi="Consolas" w:cs="Consolas"/>
+                <w:sz w:val="19"/>
+                <w:szCs w:val="19"/>
+              </w:rPr>
+              <w:t>2</w:t>
             </w:r>
           </w:p>
         </w:tc>
@@ -639,7 +861,25 @@
                 <w:sz w:val="19"/>
                 <w:szCs w:val="19"/>
               </w:rPr>
-              <w:t>ADD R2,R4,R1</w:t>
+              <w:t>ADD R</w:t>
+            </w:r>
+            <w:proofErr w:type="gramStart"/>
+            <w:r>
+              <w:rPr>
+                <w:rFonts w:ascii="Consolas" w:eastAsia="Consolas" w:hAnsi="Consolas" w:cs="Consolas"/>
+                <w:sz w:val="19"/>
+                <w:szCs w:val="19"/>
+              </w:rPr>
+              <w:t>2,R4,R</w:t>
+            </w:r>
+            <w:proofErr w:type="gramEnd"/>
+            <w:r>
+              <w:rPr>
+                <w:rFonts w:ascii="Consolas" w:eastAsia="Consolas" w:hAnsi="Consolas" w:cs="Consolas"/>
+                <w:sz w:val="19"/>
+                <w:szCs w:val="19"/>
+              </w:rPr>
+              <w:t>1</w:t>
             </w:r>
           </w:p>
         </w:tc>
@@ -691,7 +931,29 @@
           <w:sz w:val="22"/>
           <w:szCs w:val="22"/>
         </w:rPr>
-        <w:t>Answer:  R1 = 8  (binary 1000)</w:t>
+        <w:t xml:space="preserve">Answer:  R1 = </w:t>
+      </w:r>
+      <w:proofErr w:type="gramStart"/>
+      <w:r>
+        <w:rPr>
+          <w:rFonts w:ascii="Calibri" w:eastAsia="Calibri" w:hAnsi="Calibri" w:cs="Calibri"/>
+          <w:b/>
+          <w:bCs/>
+          <w:sz w:val="22"/>
+          <w:szCs w:val="22"/>
+        </w:rPr>
+        <w:t>8  (</w:t>
+      </w:r>
+      <w:proofErr w:type="gramEnd"/>
+      <w:r>
+        <w:rPr>
+          <w:rFonts w:ascii="Calibri" w:eastAsia="Calibri" w:hAnsi="Calibri" w:cs="Calibri"/>
+          <w:b/>
+          <w:bCs/>
+          <w:sz w:val="22"/>
+          <w:szCs w:val="22"/>
+        </w:rPr>
+        <w:t>binary 1000)</w:t>
       </w:r>
     </w:p>
     <w:p>
@@ -1503,12 +1765,10 @@
           <w:sz w:val="21"/>
           <w:szCs w:val="21"/>
         </w:rPr>
-        <w:t>Result:  Quotient Q = 0101 (5),  Remainder A = 0000 (0)</w:t>
-      </w:r>
-    </w:p>
-    <w:p>
-      <w:pPr>
-        <w:spacing w:after="60"/>
+        <w:t>Result:  Quotient Q = 0101 (5</w:t>
+      </w:r>
+      <w:proofErr w:type="gramStart"/>
+      <w:r>
         <w:rPr>
           <w:rFonts w:ascii="Calibri" w:eastAsia="Calibri" w:hAnsi="Calibri" w:cs="Calibri"/>
           <w:b/>
@@ -1516,12 +1776,9 @@
           <w:sz w:val="21"/>
           <w:szCs w:val="21"/>
         </w:rPr>
-      </w:pPr>
-    </w:p>
-    <w:p>
-      <w:pPr>
-        <w:spacing w:after="60"/>
-      </w:pPr>
+        <w:t>),  Remainder</w:t>
+      </w:r>
+      <w:proofErr w:type="gramEnd"/>
       <w:r>
         <w:rPr>
           <w:rFonts w:ascii="Calibri" w:eastAsia="Calibri" w:hAnsi="Calibri" w:cs="Calibri"/>
@@ -1530,6 +1787,33 @@
           <w:sz w:val="21"/>
           <w:szCs w:val="21"/>
         </w:rPr>
+        <w:t xml:space="preserve"> A = 0000 (0)</w:t>
+      </w:r>
+    </w:p>
+    <w:p>
+      <w:pPr>
+        <w:spacing w:after="60"/>
+        <w:rPr>
+          <w:rFonts w:ascii="Calibri" w:eastAsia="Calibri" w:hAnsi="Calibri" w:cs="Calibri"/>
+          <w:b/>
+          <w:bCs/>
+          <w:sz w:val="21"/>
+          <w:szCs w:val="21"/>
+        </w:rPr>
+      </w:pPr>
+    </w:p>
+    <w:p>
+      <w:pPr>
+        <w:spacing w:after="60"/>
+      </w:pPr>
+      <w:r>
+        <w:rPr>
+          <w:rFonts w:ascii="Calibri" w:eastAsia="Calibri" w:hAnsi="Calibri" w:cs="Calibri"/>
+          <w:b/>
+          <w:bCs/>
+          <w:sz w:val="21"/>
+          <w:szCs w:val="21"/>
+        </w:rPr>
         <w:lastRenderedPageBreak/>
         <w:t>(b) Non-Restoring Division</w:t>
       </w:r>
@@ -1544,10 +1828,10 @@
           <w:noProof/>
         </w:rPr>
         <w:drawing>
-          <wp:inline distT="0" distB="0" distL="0" distR="0" wp14:anchorId="5A3E59AB" wp14:editId="5EBD660A">
-            <wp:extent cx="7048500" cy="6153150"/>
+          <wp:inline distT="0" distB="0" distL="0" distR="0" wp14:anchorId="60FAA93C" wp14:editId="0D21A66F">
+            <wp:extent cx="7052310" cy="3969385"/>
             <wp:effectExtent l="0" t="0" r="0" b="0"/>
-            <wp:docPr id="1260095059" name="Picture 2"/>
+            <wp:docPr id="150584759" name="Picture 1"/>
             <wp:cNvGraphicFramePr>
               <a:graphicFrameLocks xmlns:a="http://schemas.openxmlformats.org/drawingml/2006/main" noChangeAspect="1"/>
             </wp:cNvGraphicFramePr>
@@ -1555,36 +1839,23 @@
               <a:graphicData uri="http://schemas.openxmlformats.org/drawingml/2006/picture">
                 <pic:pic xmlns:pic="http://schemas.openxmlformats.org/drawingml/2006/picture">
                   <pic:nvPicPr>
-                    <pic:cNvPr id="0" name="Picture 2"/>
-                    <pic:cNvPicPr>
-                      <a:picLocks noChangeAspect="1" noChangeArrowheads="1"/>
-                    </pic:cNvPicPr>
+                    <pic:cNvPr id="150584759" name=""/>
+                    <pic:cNvPicPr/>
                   </pic:nvPicPr>
                   <pic:blipFill>
-                    <a:blip r:embed="rId6">
-                      <a:extLst>
-                        <a:ext uri="{28A0092B-C50C-407E-A947-70E740481C1C}">
-                          <a14:useLocalDpi xmlns:a14="http://schemas.microsoft.com/office/drawing/2010/main" val="0"/>
-                        </a:ext>
-                      </a:extLst>
-                    </a:blip>
-                    <a:srcRect/>
+                    <a:blip r:embed="rId6"/>
                     <a:stretch>
                       <a:fillRect/>
                     </a:stretch>
                   </pic:blipFill>
-                  <pic:spPr bwMode="auto">
+                  <pic:spPr>
                     <a:xfrm>
                       <a:off x="0" y="0"/>
-                      <a:ext cx="7048500" cy="6153150"/>
+                      <a:ext cx="7052310" cy="3969385"/>
                     </a:xfrm>
                     <a:prstGeom prst="rect">
                       <a:avLst/>
                     </a:prstGeom>
-                    <a:noFill/>
-                    <a:ln>
-                      <a:noFill/>
-                    </a:ln>
                   </pic:spPr>
                 </pic:pic>
               </a:graphicData>
@@ -2160,7 +2431,29 @@
           <w:sz w:val="21"/>
           <w:szCs w:val="21"/>
         </w:rPr>
-        <w:t>Result:  Quotient Q = 0101 (5),  Remainder A = 0000 (0)</w:t>
+        <w:t>Result:  Quotient Q = 0101 (5</w:t>
+      </w:r>
+      <w:proofErr w:type="gramStart"/>
+      <w:r>
+        <w:rPr>
+          <w:rFonts w:ascii="Calibri" w:eastAsia="Calibri" w:hAnsi="Calibri" w:cs="Calibri"/>
+          <w:b/>
+          <w:bCs/>
+          <w:sz w:val="21"/>
+          <w:szCs w:val="21"/>
+        </w:rPr>
+        <w:t>),  Remainder</w:t>
+      </w:r>
+      <w:proofErr w:type="gramEnd"/>
+      <w:r>
+        <w:rPr>
+          <w:rFonts w:ascii="Calibri" w:eastAsia="Calibri" w:hAnsi="Calibri" w:cs="Calibri"/>
+          <w:b/>
+          <w:bCs/>
+          <w:sz w:val="21"/>
+          <w:szCs w:val="21"/>
+        </w:rPr>
+        <w:t xml:space="preserve"> A = 0000 (0)</w:t>
       </w:r>
     </w:p>
     <w:p>

</xml_diff>